<commit_message>
content(experience): reshape four bullets in the current Rokt entry
- Mobile v2 offers becomes the web SDK's move onto the new backend
  architecture, framed around safe partner-by-partner ramping.
- Drops the standalone render-latency regression bullet; the performance
  angle now lives in the team-leverage bullet as a safeguard.
- Swaps the migration-investigations bullet for partner onboarding as the
  SDK technical expert.
- Trims the accelerator pitches and the testcafe-hammerhead credit.

Co-Authored-By: Claude Opus 5 <noreply@anthropic.com>
</commit_message>
<xml_diff>
--- a/static/resume.docx
+++ b/static/resume.docx
@@ -95,7 +95,7 @@
         </w:numPr>
       </w:pPr>
       <w:r>
-        <w:t xml:space="preserve">Shipped the v2 offers path on both mobile SDKs: built Android end to end, structured so retiring v1 later is a clean delete, and carried a teammate’s in-flight iOS work through to merged and verified live against the provider.</w:t>
+        <w:t xml:space="preserve">Moved the web SDK’s offer-selection path onto the platform’s new backend architecture, ramping partner by partner behind routing controls with parity checks and per-partner monitoring at each step, so any revenue impact stayed visible and reversible.</w:t>
       </w:r>
     </w:p>
     <w:p>
@@ -119,7 +119,7 @@
         </w:numPr>
       </w:pPr>
       <w:r>
-        <w:t xml:space="preserve">Cut SDK time to interactive by 11% at p50 and 12% at p95 through code-splitting, an explicit browser-support floor that let legacy polyfills go, and phasing bootstrap into critical and deferred work. Separately traced a ~325ms p95 render-latency regression on a top-tier partner to always-on code a rollout had left behind an incomplete kill switch, recovering ~247ms across 7.6M sessions.</w:t>
+        <w:t xml:space="preserve">Cut SDK time to interactive by 11% at p50 and 12% at p95 through code-splitting, an explicit browser-support floor that let legacy polyfills go, and phasing bootstrap into critical and deferred work. Modelled at a 0.3-1.9% revenue lift depending on percentile.</w:t>
       </w:r>
     </w:p>
     <w:p>
@@ -143,19 +143,19 @@
         </w:numPr>
       </w:pPr>
       <w:r>
-        <w:t xml:space="preserve">Ran the investigations that kept the migration window honest, reclassifying a reported multi-advertiser revenue loss down to the handful actually affected, and diagnosed a cookie public-suffix bug where domain fallback resolved a partner’s parent domain to a suffix browsers reject, silently breaking first-party session continuity across their subdomains during go-live.</w:t>
-      </w:r>
-    </w:p>
-    <w:p>
-      <w:pPr>
-        <w:pStyle w:val="Body"/>
-        <w:numPr>
-          <w:ilvl w:val="0"/>
-          <w:numId w:val="1"/>
-        </w:numPr>
-      </w:pPr>
-      <w:r>
-        <w:t xml:space="preserve">Invested in team leverage: guardrails for AI-generated code and performance guidelines in AGENTS.md, reusable playbooks for pitching and code review, three engineering initiatives pitched through the internal accelerator, and an upstream fix merged into the open-source testcafe-hammerhead project.</w:t>
+        <w:t xml:space="preserve">Acted as the SDK technical expert during partner onboarding, fielding integration questions and clearing blockers for partners including Cinemark, eBay, and Kroger.</w:t>
+      </w:r>
+    </w:p>
+    <w:p>
+      <w:pPr>
+        <w:pStyle w:val="Body"/>
+        <w:numPr>
+          <w:ilvl w:val="0"/>
+          <w:numId w:val="1"/>
+        </w:numPr>
+      </w:pPr>
+      <w:r>
+        <w:t xml:space="preserve">Invested in team leverage: guardrails for AI-generated code and performance guidelines in AGENTS.md that keep render-latency regressions from reaching partner pages, plus reusable playbooks for pitching and code review.</w:t>
       </w:r>
     </w:p>
     <w:p>

</xml_diff>

<commit_message>
content(experience): lead with the migration, frame pact as its safeguard
Swaps the first two bullets so the migration comes first, and rewrites the
pact bullet to hang off it and close on what it bought.

Co-Authored-By: Claude Opus 5 <noreply@anthropic.com>
</commit_message>
<xml_diff>
--- a/static/resume.docx
+++ b/static/resume.docx
@@ -83,19 +83,19 @@
         </w:numPr>
       </w:pPr>
       <w:r>
-        <w:t xml:space="preserve">Built the contract-testing (Pact) program from a single-repo experiment into cross-platform infrastructure covering all three SDK consumers (web, iOS, Android), the transactions provider, and the server-to-server surface.</w:t>
-      </w:r>
-    </w:p>
-    <w:p>
-      <w:pPr>
-        <w:pStyle w:val="Body"/>
-        <w:numPr>
-          <w:ilvl w:val="0"/>
-          <w:numId w:val="1"/>
-        </w:numPr>
-      </w:pPr>
-      <w:r>
         <w:t xml:space="preserve">Moved the web SDK’s offer-selection path onto the platform’s new backend architecture, ramping partner by partner behind routing controls with parity checks and per-partner monitoring at each step, so any revenue impact stayed visible and reversible.</w:t>
+      </w:r>
+    </w:p>
+    <w:p>
+      <w:pPr>
+        <w:pStyle w:val="Body"/>
+        <w:numPr>
+          <w:ilvl w:val="0"/>
+          <w:numId w:val="1"/>
+        </w:numPr>
+      </w:pPr>
+      <w:r>
+        <w:t xml:space="preserve">Introduced contract testing (Pact) to de-risk that migration, growing it from a single-repo experiment into shared infrastructure across all three SDK consumers (web, iOS, Android), the transactions provider, and the server-to-server surface, so client and server drift surfaces at review time rather than after release.</w:t>
       </w:r>
     </w:p>
     <w:p>

</xml_diff>

<commit_message>
content(experience): reorder bullets, refresh on-call, move role to NYC
Leads with time to interactive and drops its mechanism clause. On-call
bullet now names the diagnose-alerts skill instead of the runbook detail.

Co-Authored-By: Claude Opus 5 <noreply@anthropic.com>
</commit_message>
<xml_diff>
--- a/static/resume.docx
+++ b/static/resume.docx
@@ -71,7 +71,19 @@
         <w:pStyle w:val="Meta"/>
       </w:pPr>
       <w:r>
-        <w:t xml:space="preserve">Sydney, Australia  |  Feb 2026 - Present</w:t>
+        <w:t xml:space="preserve">New York, USA  |  Feb 2026 - Present</w:t>
+      </w:r>
+    </w:p>
+    <w:p>
+      <w:pPr>
+        <w:pStyle w:val="Body"/>
+        <w:numPr>
+          <w:ilvl w:val="0"/>
+          <w:numId w:val="1"/>
+        </w:numPr>
+      </w:pPr>
+      <w:r>
+        <w:t xml:space="preserve">Cut SDK time to interactive by 11% at p50 and 12% at p95. Modelled at a 0.3-1.9% revenue lift depending on percentile.</w:t>
       </w:r>
     </w:p>
     <w:p>
@@ -119,19 +131,7 @@
         </w:numPr>
       </w:pPr>
       <w:r>
-        <w:t xml:space="preserve">Cut SDK time to interactive by 11% at p50 and 12% at p95 through code-splitting, an explicit browser-support floor that let legacy polyfills go, and phasing bootstrap into critical and deferred work. Modelled at a 0.3-1.9% revenue lift depending on percentile.</w:t>
-      </w:r>
-    </w:p>
-    <w:p>
-      <w:pPr>
-        <w:pStyle w:val="Body"/>
-        <w:numPr>
-          <w:ilvl w:val="0"/>
-          <w:numId w:val="1"/>
-        </w:numPr>
-      </w:pPr>
-      <w:r>
-        <w:t xml:space="preserve">Rebuilt the on-call surface ahead of new engineers joining the rotation: replaced a stale 9-code runbook with one covering the ~150 error codes the SDK actually emits, and added back-tested per-code monitors.</w:t>
+        <w:t xml:space="preserve">Rebuilt the on-call surface ahead of new engineers joining the rotation. Introduced a diagnose-alerts skill to help engineers diagnose SDK issues.</w:t>
       </w:r>
     </w:p>
     <w:p>

</xml_diff>

<commit_message>
fix(resume): render the full CRT monogram, restore the 2019-2025 bullets
The mark only ever drew two letters. It now steps every initial down the
circle's diagonal, so three fit.

Also puts back the two bullets trimmed from the first Rokt entry when the
résumé was first generated; page two had the room for them.

Co-Authored-By: Claude Opus 5 <noreply@anthropic.com>
</commit_message>
<xml_diff>
--- a/static/resume.docx
+++ b/static/resume.docx
@@ -307,6 +307,18 @@
         </w:numPr>
       </w:pPr>
       <w:r>
+        <w:t xml:space="preserve">Built and maintained client-side UI components displayed as offers to customers using React, TypeScript, Redux, and RxJS.</w:t>
+      </w:r>
+    </w:p>
+    <w:p>
+      <w:pPr>
+        <w:pStyle w:val="Body"/>
+        <w:numPr>
+          <w:ilvl w:val="0"/>
+          <w:numId w:val="1"/>
+        </w:numPr>
+      </w:pPr>
+      <w:r>
         <w:t xml:space="preserve">Adoption at scale: the SDK is deployed across top-tier companies including Ticketmaster, Best Buy, Domino’s, and AMC Theatres, powering customer engagement across millions of users.</w:t>
       </w:r>
     </w:p>
@@ -320,6 +332,18 @@
       </w:pPr>
       <w:r>
         <w:t xml:space="preserve">High-volume transactions: designed and developed an SDK handling over a million transactions daily, generating almost $2 million in daily revenue.</w:t>
+      </w:r>
+    </w:p>
+    <w:p>
+      <w:pPr>
+        <w:pStyle w:val="Body"/>
+        <w:numPr>
+          <w:ilvl w:val="0"/>
+          <w:numId w:val="1"/>
+        </w:numPr>
+      </w:pPr>
+      <w:r>
+        <w:t xml:space="preserve">Established and enforced coding standards and best practices, and maintained app deployments through CI/CD pipelines.</w:t>
       </w:r>
     </w:p>
     <w:p>

</xml_diff>